<commit_message>
docs: 按 PR #33 review 修正交付材料 (#7)
- 项目介绍：本地核验只在确认页；原文件下载才校验成员身份（更正
  「里程碑详情也限成员」的错误说法）；课程名改为「课程综合实践Ⅱ」
- PPT：第 4 页 txId 说法、第 9 页响应式说法与实际一致；截图裁掉侧栏
  并放大，标签移到截图上方；第 2、3 页卡片文字顶部对齐；去掉私有仓库
  地址；第 1–4 页备注换成杨宇的讲稿（#35）
- 打分表：表头「参考分」改为「评分」，补记杨宇对 PR #33 的 review；
  重新生成两份 Word

Co-Authored-By: Claude Opus 5.5 <noreply@anthropic.com>
</commit_message>
<xml_diff>
--- a/docs/defense/ChainProof-成员分工与贡献打分.docx
+++ b/docs/defense/ChainProof-成员分工与贡献打分.docx
@@ -25,7 +25,7 @@
     <w:p>
       <w:pPr>
         <w:pStyle w:val="a3"/>
-        <w:divId w:val="1075393685"/>
+        <w:divId w:val="918946668"/>
         <w:rPr>
           <w:rFonts w:ascii="微软雅黑" w:eastAsia="微软雅黑" w:hAnsi="微软雅黑" w:hint="eastAsia"/>
           <w:color w:val="475569"/>
@@ -64,7 +64,7 @@
     <w:p>
       <w:pPr>
         <w:pStyle w:val="a3"/>
-        <w:divId w:val="1075393685"/>
+        <w:divId w:val="918946668"/>
         <w:rPr>
           <w:rFonts w:ascii="微软雅黑" w:eastAsia="微软雅黑" w:hAnsi="微软雅黑" w:hint="eastAsia"/>
           <w:color w:val="475569"/>
@@ -1043,182 +1043,6 @@
         <w:t>二、贡献打分</w:t>
       </w:r>
     </w:p>
-    <w:p>
-      <w:pPr>
-        <w:pStyle w:val="a3"/>
-        <w:divId w:val="1683780046"/>
-        <w:rPr>
-          <w:rFonts w:ascii="微软雅黑" w:eastAsia="微软雅黑" w:hAnsi="微软雅黑" w:hint="eastAsia"/>
-          <w:color w:val="475569"/>
-          <w:sz w:val="21"/>
-          <w:szCs w:val="21"/>
-        </w:rPr>
-      </w:pPr>
-      <w:r>
-        <w:rPr>
-          <w:rFonts w:ascii="Segoe UI Emoji" w:eastAsia="微软雅黑" w:hAnsi="Segoe UI Emoji" w:cs="Segoe UI Emoji"/>
-          <w:color w:val="475569"/>
-          <w:sz w:val="21"/>
-          <w:szCs w:val="21"/>
-        </w:rPr>
-        <w:t>⚠</w:t>
-      </w:r>
-      <w:r>
-        <w:rPr>
-          <w:rFonts w:ascii="Segoe UI Emoji" w:eastAsia="微软雅黑" w:hAnsi="Segoe UI Emoji" w:cs="Segoe UI Emoji"/>
-          <w:color w:val="475569"/>
-          <w:sz w:val="21"/>
-          <w:szCs w:val="21"/>
-        </w:rPr>
-        <w:t>️</w:t>
-      </w:r>
-      <w:r>
-        <w:rPr>
-          <w:rFonts w:ascii="微软雅黑" w:eastAsia="微软雅黑" w:hAnsi="微软雅黑" w:hint="eastAsia"/>
-          <w:color w:val="475569"/>
-          <w:sz w:val="21"/>
-          <w:szCs w:val="21"/>
-        </w:rPr>
-        <w:t xml:space="preserve"> </w:t>
-      </w:r>
-      <w:r>
-        <w:rPr>
-          <w:rFonts w:ascii="微软雅黑" w:eastAsia="微软雅黑" w:hAnsi="微软雅黑" w:hint="eastAsia"/>
-          <w:color w:val="475569"/>
-          <w:sz w:val="21"/>
-          <w:szCs w:val="21"/>
-        </w:rPr>
-        <w:t>以下为</w:t>
-      </w:r>
-      <w:r>
-        <w:rPr>
-          <w:rStyle w:val="a6"/>
-          <w:rFonts w:ascii="微软雅黑" w:eastAsia="微软雅黑" w:hAnsi="微软雅黑" w:hint="eastAsia"/>
-          <w:color w:val="475569"/>
-          <w:sz w:val="21"/>
-          <w:szCs w:val="21"/>
-        </w:rPr>
-        <w:t>参考分</w:t>
-      </w:r>
-      <w:r>
-        <w:rPr>
-          <w:rFonts w:ascii="微软雅黑" w:eastAsia="微软雅黑" w:hAnsi="微软雅黑" w:hint="eastAsia"/>
-          <w:color w:val="475569"/>
-          <w:sz w:val="21"/>
-          <w:szCs w:val="21"/>
-        </w:rPr>
-        <w:t>，由</w:t>
-      </w:r>
-      <w:r>
-        <w:rPr>
-          <w:rFonts w:ascii="微软雅黑" w:eastAsia="微软雅黑" w:hAnsi="微软雅黑" w:hint="eastAsia"/>
-          <w:color w:val="475569"/>
-          <w:sz w:val="21"/>
-          <w:szCs w:val="21"/>
-        </w:rPr>
-        <w:t xml:space="preserve"> Claude </w:t>
-      </w:r>
-      <w:r>
-        <w:rPr>
-          <w:rFonts w:ascii="微软雅黑" w:eastAsia="微软雅黑" w:hAnsi="微软雅黑" w:hint="eastAsia"/>
-          <w:color w:val="475569"/>
-          <w:sz w:val="21"/>
-          <w:szCs w:val="21"/>
-        </w:rPr>
-        <w:t>依据</w:t>
-      </w:r>
-      <w:r>
-        <w:rPr>
-          <w:rFonts w:ascii="微软雅黑" w:eastAsia="微软雅黑" w:hAnsi="微软雅黑" w:hint="eastAsia"/>
-          <w:color w:val="475569"/>
-          <w:sz w:val="21"/>
-          <w:szCs w:val="21"/>
-        </w:rPr>
-        <w:t xml:space="preserve"> GitHub </w:t>
-      </w:r>
-      <w:r>
-        <w:rPr>
-          <w:rFonts w:ascii="微软雅黑" w:eastAsia="微软雅黑" w:hAnsi="微软雅黑" w:hint="eastAsia"/>
-          <w:color w:val="475569"/>
-          <w:sz w:val="21"/>
-          <w:szCs w:val="21"/>
-        </w:rPr>
-        <w:t>记录整理，</w:t>
-      </w:r>
-      <w:r>
-        <w:rPr>
-          <w:rStyle w:val="a6"/>
-          <w:rFonts w:ascii="微软雅黑" w:eastAsia="微软雅黑" w:hAnsi="微软雅黑" w:hint="eastAsia"/>
-          <w:color w:val="475569"/>
-          <w:sz w:val="21"/>
-          <w:szCs w:val="21"/>
-        </w:rPr>
-        <w:t>最终分数由组长确认后修改</w:t>
-      </w:r>
-      <w:r>
-        <w:rPr>
-          <w:rFonts w:ascii="微软雅黑" w:eastAsia="微软雅黑" w:hAnsi="微软雅黑" w:hint="eastAsia"/>
-          <w:color w:val="475569"/>
-          <w:sz w:val="21"/>
-          <w:szCs w:val="21"/>
-        </w:rPr>
-        <w:t>。第</w:t>
-      </w:r>
-      <w:r>
-        <w:rPr>
-          <w:rFonts w:ascii="微软雅黑" w:eastAsia="微软雅黑" w:hAnsi="微软雅黑" w:hint="eastAsia"/>
-          <w:color w:val="475569"/>
-          <w:sz w:val="21"/>
-          <w:szCs w:val="21"/>
-        </w:rPr>
-        <w:t xml:space="preserve"> 4 </w:t>
-      </w:r>
-      <w:r>
-        <w:rPr>
-          <w:rFonts w:ascii="微软雅黑" w:eastAsia="微软雅黑" w:hAnsi="微软雅黑" w:hint="eastAsia"/>
-          <w:color w:val="475569"/>
-          <w:sz w:val="21"/>
-          <w:szCs w:val="21"/>
-        </w:rPr>
-        <w:t>周交付任务（</w:t>
-      </w:r>
-      <w:r>
-        <w:rPr>
-          <w:rFonts w:ascii="微软雅黑" w:eastAsia="微软雅黑" w:hAnsi="微软雅黑" w:hint="eastAsia"/>
-          <w:color w:val="475569"/>
-          <w:sz w:val="21"/>
-          <w:szCs w:val="21"/>
-        </w:rPr>
-        <w:t>#34 ~ #36</w:t>
-      </w:r>
-      <w:r>
-        <w:rPr>
-          <w:rFonts w:ascii="微软雅黑" w:eastAsia="微软雅黑" w:hAnsi="微软雅黑" w:hint="eastAsia"/>
-          <w:color w:val="475569"/>
-          <w:sz w:val="21"/>
-          <w:szCs w:val="21"/>
-        </w:rPr>
-        <w:t>）尚未完成，建议在</w:t>
-      </w:r>
-      <w:r>
-        <w:rPr>
-          <w:rFonts w:ascii="微软雅黑" w:eastAsia="微软雅黑" w:hAnsi="微软雅黑" w:hint="eastAsia"/>
-          <w:color w:val="475569"/>
-          <w:sz w:val="21"/>
-          <w:szCs w:val="21"/>
-        </w:rPr>
-        <w:t xml:space="preserve"> 10-28 </w:t>
-      </w:r>
-      <w:r>
-        <w:rPr>
-          <w:rFonts w:ascii="微软雅黑" w:eastAsia="微软雅黑" w:hAnsi="微软雅黑" w:hint="eastAsia"/>
-          <w:color w:val="475569"/>
-          <w:sz w:val="21"/>
-          <w:szCs w:val="21"/>
-        </w:rPr>
-        <w:t>完成后再定稿。</w:t>
-      </w:r>
-    </w:p>
     <w:tbl>
       <w:tblPr>
         <w:tblW w:w="5000" w:type="pct"/>
@@ -1232,8 +1056,8 @@
       </w:tblPr>
       <w:tblGrid>
         <w:gridCol w:w="810"/>
-        <w:gridCol w:w="810"/>
-        <w:gridCol w:w="6670"/>
+        <w:gridCol w:w="620"/>
+        <w:gridCol w:w="6860"/>
       </w:tblGrid>
       <w:tr>
         <w:trPr>
@@ -1280,7 +1104,6 @@
                 <w:sz w:val="19"/>
                 <w:szCs w:val="19"/>
               </w:rPr>
-              <w:lastRenderedPageBreak/>
               <w:t>成员</w:t>
             </w:r>
           </w:p>
@@ -1326,7 +1149,7 @@
                 <w:sz w:val="19"/>
                 <w:szCs w:val="19"/>
               </w:rPr>
-              <w:t>参考分</w:t>
+              <w:t>评分</w:t>
             </w:r>
           </w:p>
         </w:tc>
@@ -1656,6 +1479,7 @@
                 <w:sz w:val="19"/>
                 <w:szCs w:val="19"/>
               </w:rPr>
+              <w:lastRenderedPageBreak/>
               <w:t>杨宇</w:t>
             </w:r>
           </w:p>
@@ -1886,7 +1710,7 @@
                 <w:sz w:val="19"/>
                 <w:szCs w:val="19"/>
               </w:rPr>
-              <w:t xml:space="preserve">Review 2 </w:t>
+              <w:t xml:space="preserve">Review 3 </w:t>
             </w:r>
             <w:r>
               <w:rPr>
@@ -1905,6 +1729,33 @@
                 <w:szCs w:val="19"/>
               </w:rPr>
               <w:t xml:space="preserve"> PR</w:t>
+            </w:r>
+            <w:r>
+              <w:rPr>
+                <w:rFonts w:ascii="微软雅黑" w:eastAsia="微软雅黑" w:hAnsi="微软雅黑" w:hint="eastAsia"/>
+                <w:color w:val="0F172A"/>
+                <w:sz w:val="19"/>
+                <w:szCs w:val="19"/>
+              </w:rPr>
+              <w:t>，其中逐条对照代码审核交付材料（</w:t>
+            </w:r>
+            <w:r>
+              <w:rPr>
+                <w:rFonts w:ascii="微软雅黑" w:eastAsia="微软雅黑" w:hAnsi="微软雅黑" w:hint="eastAsia"/>
+                <w:color w:val="0F172A"/>
+                <w:sz w:val="19"/>
+                <w:szCs w:val="19"/>
+              </w:rPr>
+              <w:t>PR #33</w:t>
+            </w:r>
+            <w:r>
+              <w:rPr>
+                <w:rFonts w:ascii="微软雅黑" w:eastAsia="微软雅黑" w:hAnsi="微软雅黑" w:hint="eastAsia"/>
+                <w:color w:val="0F172A"/>
+                <w:sz w:val="19"/>
+                <w:szCs w:val="19"/>
+              </w:rPr>
+              <w:t>）</w:t>
             </w:r>
           </w:p>
         </w:tc>
@@ -2493,6 +2344,7 @@
               <w:bottom w:val="single" w:sz="6" w:space="0" w:color="CBD5E1"/>
               <w:right w:val="single" w:sz="6" w:space="0" w:color="CBD5E1"/>
             </w:tcBorders>
+            <w:noWrap/>
             <w:tcMar>
               <w:top w:w="80" w:type="dxa"/>
               <w:left w:w="120" w:type="dxa"/>
@@ -2511,6 +2363,134 @@
                 <w:szCs w:val="19"/>
               </w:rPr>
             </w:pPr>
+            <w:r>
+              <w:rPr>
+                <w:rFonts w:ascii="微软雅黑" w:eastAsia="微软雅黑" w:hAnsi="微软雅黑" w:hint="eastAsia"/>
+                <w:color w:val="0F172A"/>
+                <w:sz w:val="19"/>
+                <w:szCs w:val="19"/>
+              </w:rPr>
+              <w:t>10</w:t>
+            </w:r>
+          </w:p>
+        </w:tc>
+        <w:tc>
+          <w:tcPr>
+            <w:tcW w:w="0" w:type="auto"/>
+            <w:tcBorders>
+              <w:top w:val="single" w:sz="6" w:space="0" w:color="CBD5E1"/>
+              <w:left w:val="single" w:sz="6" w:space="0" w:color="CBD5E1"/>
+              <w:bottom w:val="single" w:sz="6" w:space="0" w:color="CBD5E1"/>
+              <w:right w:val="single" w:sz="6" w:space="0" w:color="CBD5E1"/>
+            </w:tcBorders>
+            <w:noWrap/>
+            <w:tcMar>
+              <w:top w:w="80" w:type="dxa"/>
+              <w:left w:w="120" w:type="dxa"/>
+              <w:bottom w:w="80" w:type="dxa"/>
+              <w:right w:w="120" w:type="dxa"/>
+            </w:tcMar>
+            <w:hideMark/>
+          </w:tcPr>
+          <w:p>
+            <w:pPr>
+              <w:spacing w:before="120" w:after="120"/>
+              <w:rPr>
+                <w:rFonts w:ascii="微软雅黑" w:eastAsia="微软雅黑" w:hAnsi="微软雅黑" w:hint="eastAsia"/>
+                <w:color w:val="0F172A"/>
+                <w:sz w:val="19"/>
+                <w:szCs w:val="19"/>
+              </w:rPr>
+            </w:pPr>
+            <w:r>
+              <w:rPr>
+                <w:rFonts w:ascii="微软雅黑" w:eastAsia="微软雅黑" w:hAnsi="微软雅黑" w:hint="eastAsia"/>
+                <w:color w:val="0F172A"/>
+                <w:sz w:val="19"/>
+                <w:szCs w:val="19"/>
+              </w:rPr>
+              <w:t>√</w:t>
+            </w:r>
+          </w:p>
+        </w:tc>
+      </w:tr>
+      <w:tr>
+        <w:tc>
+          <w:tcPr>
+            <w:tcW w:w="0" w:type="auto"/>
+            <w:tcBorders>
+              <w:top w:val="single" w:sz="6" w:space="0" w:color="CBD5E1"/>
+              <w:left w:val="single" w:sz="6" w:space="0" w:color="CBD5E1"/>
+              <w:bottom w:val="single" w:sz="6" w:space="0" w:color="CBD5E1"/>
+              <w:right w:val="single" w:sz="6" w:space="0" w:color="CBD5E1"/>
+            </w:tcBorders>
+            <w:noWrap/>
+            <w:tcMar>
+              <w:top w:w="80" w:type="dxa"/>
+              <w:left w:w="120" w:type="dxa"/>
+              <w:bottom w:w="80" w:type="dxa"/>
+              <w:right w:w="120" w:type="dxa"/>
+            </w:tcMar>
+            <w:hideMark/>
+          </w:tcPr>
+          <w:p>
+            <w:pPr>
+              <w:spacing w:before="120" w:after="120"/>
+              <w:rPr>
+                <w:rFonts w:ascii="微软雅黑" w:eastAsia="微软雅黑" w:hAnsi="微软雅黑" w:hint="eastAsia"/>
+                <w:color w:val="0F172A"/>
+                <w:sz w:val="19"/>
+                <w:szCs w:val="19"/>
+              </w:rPr>
+            </w:pPr>
+            <w:r>
+              <w:rPr>
+                <w:rFonts w:ascii="微软雅黑" w:eastAsia="微软雅黑" w:hAnsi="微软雅黑" w:hint="eastAsia"/>
+                <w:color w:val="0F172A"/>
+                <w:sz w:val="19"/>
+                <w:szCs w:val="19"/>
+              </w:rPr>
+              <w:t>杨宇</w:t>
+            </w:r>
+          </w:p>
+        </w:tc>
+        <w:tc>
+          <w:tcPr>
+            <w:tcW w:w="0" w:type="auto"/>
+            <w:tcBorders>
+              <w:top w:val="single" w:sz="6" w:space="0" w:color="CBD5E1"/>
+              <w:left w:val="single" w:sz="6" w:space="0" w:color="CBD5E1"/>
+              <w:bottom w:val="single" w:sz="6" w:space="0" w:color="CBD5E1"/>
+              <w:right w:val="single" w:sz="6" w:space="0" w:color="CBD5E1"/>
+            </w:tcBorders>
+            <w:noWrap/>
+            <w:tcMar>
+              <w:top w:w="80" w:type="dxa"/>
+              <w:left w:w="120" w:type="dxa"/>
+              <w:bottom w:w="80" w:type="dxa"/>
+              <w:right w:w="120" w:type="dxa"/>
+            </w:tcMar>
+            <w:hideMark/>
+          </w:tcPr>
+          <w:p>
+            <w:pPr>
+              <w:spacing w:before="120" w:after="120"/>
+              <w:rPr>
+                <w:rFonts w:ascii="微软雅黑" w:eastAsia="微软雅黑" w:hAnsi="微软雅黑" w:hint="eastAsia"/>
+                <w:color w:val="0F172A"/>
+                <w:sz w:val="19"/>
+                <w:szCs w:val="19"/>
+              </w:rPr>
+            </w:pPr>
+            <w:r>
+              <w:rPr>
+                <w:rFonts w:ascii="微软雅黑" w:eastAsia="微软雅黑" w:hAnsi="微软雅黑" w:hint="eastAsia"/>
+                <w:color w:val="0F172A"/>
+                <w:sz w:val="19"/>
+                <w:szCs w:val="19"/>
+              </w:rPr>
+              <w:t>9.5</w:t>
+            </w:r>
           </w:p>
         </w:tc>
         <w:tc>
@@ -2534,9 +2514,10 @@
             <w:pPr>
               <w:spacing w:before="120" w:after="120"/>
               <w:rPr>
-                <w:rFonts w:ascii="Times New Roman" w:eastAsia="Times New Roman" w:hAnsi="Times New Roman" w:cs="Times New Roman"/>
-                <w:sz w:val="20"/>
-                <w:szCs w:val="20"/>
+                <w:rFonts w:ascii="微软雅黑" w:eastAsia="微软雅黑" w:hAnsi="微软雅黑" w:hint="eastAsia"/>
+                <w:color w:val="0F172A"/>
+                <w:sz w:val="19"/>
+                <w:szCs w:val="19"/>
               </w:rPr>
             </w:pPr>
           </w:p>
@@ -2578,7 +2559,46 @@
                 <w:sz w:val="19"/>
                 <w:szCs w:val="19"/>
               </w:rPr>
-              <w:t>杨宇</w:t>
+              <w:t>黄铭谦</w:t>
+            </w:r>
+          </w:p>
+        </w:tc>
+        <w:tc>
+          <w:tcPr>
+            <w:tcW w:w="0" w:type="auto"/>
+            <w:tcBorders>
+              <w:top w:val="single" w:sz="6" w:space="0" w:color="CBD5E1"/>
+              <w:left w:val="single" w:sz="6" w:space="0" w:color="CBD5E1"/>
+              <w:bottom w:val="single" w:sz="6" w:space="0" w:color="CBD5E1"/>
+              <w:right w:val="single" w:sz="6" w:space="0" w:color="CBD5E1"/>
+            </w:tcBorders>
+            <w:noWrap/>
+            <w:tcMar>
+              <w:top w:w="80" w:type="dxa"/>
+              <w:left w:w="120" w:type="dxa"/>
+              <w:bottom w:w="80" w:type="dxa"/>
+              <w:right w:w="120" w:type="dxa"/>
+            </w:tcMar>
+            <w:hideMark/>
+          </w:tcPr>
+          <w:p>
+            <w:pPr>
+              <w:spacing w:before="120" w:after="120"/>
+              <w:rPr>
+                <w:rFonts w:ascii="微软雅黑" w:eastAsia="微软雅黑" w:hAnsi="微软雅黑" w:hint="eastAsia"/>
+                <w:color w:val="0F172A"/>
+                <w:sz w:val="19"/>
+                <w:szCs w:val="19"/>
+              </w:rPr>
+            </w:pPr>
+            <w:r>
+              <w:rPr>
+                <w:rFonts w:ascii="微软雅黑" w:eastAsia="微软雅黑" w:hAnsi="微软雅黑" w:hint="eastAsia"/>
+                <w:color w:val="0F172A"/>
+                <w:sz w:val="19"/>
+                <w:szCs w:val="19"/>
+              </w:rPr>
+              <w:t>9</w:t>
             </w:r>
           </w:p>
         </w:tc>
@@ -2607,132 +2627,6 @@
                 <w:color w:val="0F172A"/>
                 <w:sz w:val="19"/>
                 <w:szCs w:val="19"/>
-              </w:rPr>
-            </w:pPr>
-          </w:p>
-        </w:tc>
-        <w:tc>
-          <w:tcPr>
-            <w:tcW w:w="0" w:type="auto"/>
-            <w:tcBorders>
-              <w:top w:val="single" w:sz="6" w:space="0" w:color="CBD5E1"/>
-              <w:left w:val="single" w:sz="6" w:space="0" w:color="CBD5E1"/>
-              <w:bottom w:val="single" w:sz="6" w:space="0" w:color="CBD5E1"/>
-              <w:right w:val="single" w:sz="6" w:space="0" w:color="CBD5E1"/>
-            </w:tcBorders>
-            <w:tcMar>
-              <w:top w:w="80" w:type="dxa"/>
-              <w:left w:w="120" w:type="dxa"/>
-              <w:bottom w:w="80" w:type="dxa"/>
-              <w:right w:w="120" w:type="dxa"/>
-            </w:tcMar>
-            <w:hideMark/>
-          </w:tcPr>
-          <w:p>
-            <w:pPr>
-              <w:spacing w:before="120" w:after="120"/>
-              <w:rPr>
-                <w:rFonts w:ascii="Times New Roman" w:eastAsia="Times New Roman" w:hAnsi="Times New Roman" w:cs="Times New Roman"/>
-                <w:sz w:val="20"/>
-                <w:szCs w:val="20"/>
-              </w:rPr>
-            </w:pPr>
-          </w:p>
-        </w:tc>
-      </w:tr>
-      <w:tr>
-        <w:tc>
-          <w:tcPr>
-            <w:tcW w:w="0" w:type="auto"/>
-            <w:tcBorders>
-              <w:top w:val="single" w:sz="6" w:space="0" w:color="CBD5E1"/>
-              <w:left w:val="single" w:sz="6" w:space="0" w:color="CBD5E1"/>
-              <w:bottom w:val="single" w:sz="6" w:space="0" w:color="CBD5E1"/>
-              <w:right w:val="single" w:sz="6" w:space="0" w:color="CBD5E1"/>
-            </w:tcBorders>
-            <w:noWrap/>
-            <w:tcMar>
-              <w:top w:w="80" w:type="dxa"/>
-              <w:left w:w="120" w:type="dxa"/>
-              <w:bottom w:w="80" w:type="dxa"/>
-              <w:right w:w="120" w:type="dxa"/>
-            </w:tcMar>
-            <w:hideMark/>
-          </w:tcPr>
-          <w:p>
-            <w:pPr>
-              <w:spacing w:before="120" w:after="120"/>
-              <w:rPr>
-                <w:rFonts w:ascii="微软雅黑" w:eastAsia="微软雅黑" w:hAnsi="微软雅黑"/>
-                <w:color w:val="0F172A"/>
-                <w:sz w:val="19"/>
-                <w:szCs w:val="19"/>
-              </w:rPr>
-            </w:pPr>
-            <w:r>
-              <w:rPr>
-                <w:rFonts w:ascii="微软雅黑" w:eastAsia="微软雅黑" w:hAnsi="微软雅黑" w:hint="eastAsia"/>
-                <w:color w:val="0F172A"/>
-                <w:sz w:val="19"/>
-                <w:szCs w:val="19"/>
-              </w:rPr>
-              <w:t>黄铭谦</w:t>
-            </w:r>
-          </w:p>
-        </w:tc>
-        <w:tc>
-          <w:tcPr>
-            <w:tcW w:w="0" w:type="auto"/>
-            <w:tcBorders>
-              <w:top w:val="single" w:sz="6" w:space="0" w:color="CBD5E1"/>
-              <w:left w:val="single" w:sz="6" w:space="0" w:color="CBD5E1"/>
-              <w:bottom w:val="single" w:sz="6" w:space="0" w:color="CBD5E1"/>
-              <w:right w:val="single" w:sz="6" w:space="0" w:color="CBD5E1"/>
-            </w:tcBorders>
-            <w:tcMar>
-              <w:top w:w="80" w:type="dxa"/>
-              <w:left w:w="120" w:type="dxa"/>
-              <w:bottom w:w="80" w:type="dxa"/>
-              <w:right w:w="120" w:type="dxa"/>
-            </w:tcMar>
-            <w:hideMark/>
-          </w:tcPr>
-          <w:p>
-            <w:pPr>
-              <w:spacing w:before="120" w:after="120"/>
-              <w:rPr>
-                <w:rFonts w:ascii="微软雅黑" w:eastAsia="微软雅黑" w:hAnsi="微软雅黑" w:hint="eastAsia"/>
-                <w:color w:val="0F172A"/>
-                <w:sz w:val="19"/>
-                <w:szCs w:val="19"/>
-              </w:rPr>
-            </w:pPr>
-          </w:p>
-        </w:tc>
-        <w:tc>
-          <w:tcPr>
-            <w:tcW w:w="0" w:type="auto"/>
-            <w:tcBorders>
-              <w:top w:val="single" w:sz="6" w:space="0" w:color="CBD5E1"/>
-              <w:left w:val="single" w:sz="6" w:space="0" w:color="CBD5E1"/>
-              <w:bottom w:val="single" w:sz="6" w:space="0" w:color="CBD5E1"/>
-              <w:right w:val="single" w:sz="6" w:space="0" w:color="CBD5E1"/>
-            </w:tcBorders>
-            <w:tcMar>
-              <w:top w:w="80" w:type="dxa"/>
-              <w:left w:w="120" w:type="dxa"/>
-              <w:bottom w:w="80" w:type="dxa"/>
-              <w:right w:w="120" w:type="dxa"/>
-            </w:tcMar>
-            <w:hideMark/>
-          </w:tcPr>
-          <w:p>
-            <w:pPr>
-              <w:spacing w:before="120" w:after="120"/>
-              <w:rPr>
-                <w:rFonts w:ascii="Times New Roman" w:eastAsia="Times New Roman" w:hAnsi="Times New Roman" w:cs="Times New Roman"/>
-                <w:sz w:val="20"/>
-                <w:szCs w:val="20"/>
               </w:rPr>
             </w:pPr>
           </w:p>
@@ -3436,7 +3330,7 @@
     <w:link w:val="a8"/>
     <w:uiPriority w:val="99"/>
     <w:unhideWhenUsed/>
-    <w:rsid w:val="00E052E6"/>
+    <w:rsid w:val="003C639B"/>
     <w:pPr>
       <w:tabs>
         <w:tab w:val="center" w:pos="4153"/>
@@ -3455,7 +3349,7 @@
     <w:basedOn w:val="a0"/>
     <w:link w:val="a7"/>
     <w:uiPriority w:val="99"/>
-    <w:rsid w:val="00E052E6"/>
+    <w:rsid w:val="003C639B"/>
     <w:rPr>
       <w:rFonts w:ascii="宋体" w:eastAsia="宋体" w:hAnsi="宋体" w:cs="宋体"/>
       <w:sz w:val="18"/>
@@ -3468,7 +3362,7 @@
     <w:link w:val="aa"/>
     <w:uiPriority w:val="99"/>
     <w:unhideWhenUsed/>
-    <w:rsid w:val="00E052E6"/>
+    <w:rsid w:val="003C639B"/>
     <w:pPr>
       <w:tabs>
         <w:tab w:val="center" w:pos="4153"/>
@@ -3486,7 +3380,7 @@
     <w:basedOn w:val="a0"/>
     <w:link w:val="a9"/>
     <w:uiPriority w:val="99"/>
-    <w:rsid w:val="00E052E6"/>
+    <w:rsid w:val="003C639B"/>
     <w:rPr>
       <w:rFonts w:ascii="宋体" w:eastAsia="宋体" w:hAnsi="宋体" w:cs="宋体"/>
       <w:sz w:val="18"/>

</xml_diff>